<commit_message>
feat: SSOT prompts, global Owner doc, admin 1to1 owner fix, ncast profile URL
- docs: ADMIN_GLOBAL_OWNER_SELECTION (SPEC-003), PROMPT_SSOT_IMPROVEMENT,
  PROMPT_ADMIN_GLOBAL_OWNER_SSOT_IMPROVEMENT, INDEX, SSOT_REGISTRY, DATA_MODEL
- admin: OneToOnesList owner resolution (no default 1), Members/MemberShow/MemberEdit,
  dataProvider; meetings 1to1 layout, workshop/strategy/pdf assets
- api: ncast_profile_url on members, migration, Feature test, CSV
- progress: dragonfly_progress.md (2026-04-06 10:51 JST push entry)

Made-with: Cursor
</commit_message>
<xml_diff>
--- a/docs/academy/003_MSアドオン/07.1to1をする/1to1_planning_document_軍司さん.docx
+++ b/docs/academy/003_MSアドオン/07.1to1をする/1to1_planning_document_軍司さん.docx
@@ -76,7 +76,7 @@
       <w:pPr>
         <w:spacing w:before="240" w:after="0" w:line="240" w:lineRule="auto"/>
         <w:rPr>
-          <w:rFonts w:ascii="メイリオ" w:eastAsia="メイリオ" w:hAnsi="メイリオ" w:hint="eastAsia"/>
+          <w:rFonts w:ascii="メイリオ" w:eastAsia="メイリオ" w:hAnsi="メイリオ"/>
           <w:color w:val="080809"/>
           <w:shd w:val="clear" w:color="auto" w:fill="FFFFFF"/>
         </w:rPr>
@@ -156,31 +156,31 @@
       <w:pPr>
         <w:spacing w:before="240" w:after="0" w:line="240" w:lineRule="auto"/>
         <w:rPr>
+          <w:rFonts w:ascii="Meiryo UI" w:eastAsia="Meiryo UI" w:hAnsi="Meiryo UI" w:cs="Arial"/>
+          <w:lang w:val="en-GB"/>
+        </w:rPr>
+      </w:pPr>
+      <w:r>
+        <w:rPr>
           <w:rFonts w:ascii="Meiryo UI" w:eastAsia="Meiryo UI" w:hAnsi="Meiryo UI" w:cs="Arial" w:hint="eastAsia"/>
           <w:lang w:val="en-GB"/>
         </w:rPr>
+        <w:t>・LINEを活用したい会社</w:t>
+      </w:r>
+    </w:p>
+    <w:p>
+      <w:pPr>
+        <w:spacing w:before="240" w:after="0" w:line="240" w:lineRule="auto"/>
+        <w:rPr>
+          <w:rFonts w:ascii="Meiryo UI" w:eastAsia="Meiryo UI" w:hAnsi="Meiryo UI" w:cs="Arial"/>
+          <w:lang w:val="en-GB"/>
+        </w:rPr>
       </w:pPr>
       <w:r>
         <w:rPr>
           <w:rFonts w:ascii="Meiryo UI" w:eastAsia="Meiryo UI" w:hAnsi="Meiryo UI" w:cs="Arial" w:hint="eastAsia"/>
           <w:lang w:val="en-GB"/>
         </w:rPr>
-        <w:t>・LINEを活用したい会社</w:t>
-      </w:r>
-    </w:p>
-    <w:p>
-      <w:pPr>
-        <w:spacing w:before="240" w:after="0" w:line="240" w:lineRule="auto"/>
-        <w:rPr>
-          <w:rFonts w:ascii="Meiryo UI" w:eastAsia="Meiryo UI" w:hAnsi="Meiryo UI" w:cs="Arial" w:hint="eastAsia"/>
-          <w:lang w:val="en-GB"/>
-        </w:rPr>
-      </w:pPr>
-      <w:r>
-        <w:rPr>
-          <w:rFonts w:ascii="Meiryo UI" w:eastAsia="Meiryo UI" w:hAnsi="Meiryo UI" w:cs="Arial" w:hint="eastAsia"/>
-          <w:lang w:val="en-GB"/>
-        </w:rPr>
         <w:t>・Lステップなどをこれから導入したい会社</w:t>
       </w:r>
     </w:p>
@@ -188,7 +188,7 @@
       <w:pPr>
         <w:spacing w:before="240" w:after="0" w:line="240" w:lineRule="auto"/>
         <w:rPr>
-          <w:rFonts w:ascii="Meiryo UI" w:eastAsia="Meiryo UI" w:hAnsi="Meiryo UI" w:cs="Arial" w:hint="eastAsia"/>
+          <w:rFonts w:ascii="Meiryo UI" w:eastAsia="Meiryo UI" w:hAnsi="Meiryo UI" w:cs="Arial"/>
           <w:lang w:val="en-GB"/>
         </w:rPr>
       </w:pPr>
@@ -240,7 +240,7 @@
       <w:pPr>
         <w:spacing w:before="240" w:after="0" w:line="240" w:lineRule="auto"/>
         <w:rPr>
-          <w:rFonts w:ascii="Meiryo UI" w:eastAsia="Meiryo UI" w:hAnsi="Meiryo UI" w:cs="Arial" w:hint="eastAsia"/>
+          <w:rFonts w:ascii="Meiryo UI" w:eastAsia="Meiryo UI" w:hAnsi="Meiryo UI" w:cs="Arial"/>
         </w:rPr>
       </w:pPr>
       <w:r>
@@ -254,7 +254,7 @@
       <w:pPr>
         <w:spacing w:before="240" w:after="0" w:line="240" w:lineRule="auto"/>
         <w:rPr>
-          <w:rFonts w:ascii="Meiryo UI" w:eastAsia="Meiryo UI" w:hAnsi="Meiryo UI" w:cs="Arial" w:hint="eastAsia"/>
+          <w:rFonts w:ascii="Meiryo UI" w:eastAsia="Meiryo UI" w:hAnsi="Meiryo UI" w:cs="Arial"/>
         </w:rPr>
       </w:pPr>
       <w:r>
@@ -268,7 +268,7 @@
       <w:pPr>
         <w:spacing w:before="240" w:after="0" w:line="240" w:lineRule="auto"/>
         <w:rPr>
-          <w:rFonts w:ascii="Meiryo UI" w:eastAsia="Meiryo UI" w:hAnsi="Meiryo UI" w:cs="Arial" w:hint="eastAsia"/>
+          <w:rFonts w:ascii="Meiryo UI" w:eastAsia="Meiryo UI" w:hAnsi="Meiryo UI" w:cs="Arial"/>
         </w:rPr>
       </w:pPr>
       <w:r>
@@ -282,7 +282,7 @@
       <w:pPr>
         <w:spacing w:before="240" w:after="0" w:line="240" w:lineRule="auto"/>
         <w:rPr>
-          <w:rFonts w:ascii="Meiryo UI" w:eastAsia="Meiryo UI" w:hAnsi="Meiryo UI" w:cs="Arial" w:hint="eastAsia"/>
+          <w:rFonts w:ascii="Meiryo UI" w:eastAsia="Meiryo UI" w:hAnsi="Meiryo UI" w:cs="Arial"/>
         </w:rPr>
       </w:pPr>
       <w:r>
@@ -310,7 +310,7 @@
       <w:pPr>
         <w:spacing w:before="240" w:after="0" w:line="240" w:lineRule="auto"/>
         <w:rPr>
-          <w:rFonts w:ascii="Meiryo UI" w:eastAsia="Meiryo UI" w:hAnsi="Meiryo UI" w:hint="eastAsia"/>
+          <w:rFonts w:ascii="Meiryo UI" w:eastAsia="Meiryo UI" w:hAnsi="Meiryo UI"/>
           <w:b/>
           <w:color w:val="136A80"/>
           <w:sz w:val="28"/>

</xml_diff>